<commit_message>
Update resume with real GitHub project links
</commit_message>
<xml_diff>
--- a/assets/Lakshmi_Chekkapalli_Resume.docx
+++ b/assets/Lakshmi_Chekkapalli_Resume.docx
@@ -484,58 +484,58 @@
           <w:sz w:val="20"/>
           <w:szCs w:val="20"/>
         </w:rPr>
-        <w:t xml:space="preserve">Batch ETL Pipeline (AWS/GCP) — Building an automated pipeline to ingest, transform, and load public dataset(s) into a cloud data warehouse, orchestrated with Airflow. [GitHub link to be added]</w:t>
-      </w:r>
-    </w:p>
-    <w:p>
-      <w:pPr>
-        <w:pStyle w:val="ListParagraph"/>
-        <w:numPr>
-          <w:ilvl w:val="0"/>
-          <w:numId w:val="1"/>
-        </w:numPr>
-        <w:spacing w:after="40"/>
-      </w:pPr>
-      <w:r>
-        <w:rPr>
-          <w:sz w:val="20"/>
-          <w:szCs w:val="20"/>
-        </w:rPr>
-        <w:t xml:space="preserve">Data Transformation with dbt — Building modular, tested transformation models on a cloud data warehouse to improve data reliability and documentation. [GitHub link to be added]</w:t>
-      </w:r>
-    </w:p>
-    <w:p>
-      <w:pPr>
-        <w:pStyle w:val="ListParagraph"/>
-        <w:numPr>
-          <w:ilvl w:val="0"/>
-          <w:numId w:val="1"/>
-        </w:numPr>
-        <w:spacing w:after="40"/>
-      </w:pPr>
-      <w:r>
-        <w:rPr>
-          <w:sz w:val="20"/>
-          <w:szCs w:val="20"/>
-        </w:rPr>
-        <w:t xml:space="preserve">Real-Time Streaming Pipeline — Building a streaming pipeline processing simulated event data using Kafka/Kinesis and Spark Structured Streaming. [GitHub link to be added]</w:t>
-      </w:r>
-    </w:p>
-    <w:p>
-      <w:pPr>
-        <w:pStyle w:val="ListParagraph"/>
-        <w:numPr>
-          <w:ilvl w:val="0"/>
-          <w:numId w:val="1"/>
-        </w:numPr>
-        <w:spacing w:after="40"/>
-      </w:pPr>
-      <w:r>
-        <w:rPr>
-          <w:sz w:val="20"/>
-          <w:szCs w:val="20"/>
-        </w:rPr>
-        <w:t xml:space="preserve">ML Feature Pipeline — Building a feature engineering pipeline feeding a predictive model, automating the flow from raw data to model-ready features. [GitHub link to be added]</w:t>
+        <w:t xml:space="preserve">Batch ETL Pipeline (AWS/GCP) — Building an automated pipeline to ingest, transform, and load public dataset(s) into a cloud data warehouse, orchestrated with Airflow. github.com/lakshmichekkapalli/batch-etl-pipeline</w:t>
+      </w:r>
+    </w:p>
+    <w:p>
+      <w:pPr>
+        <w:pStyle w:val="ListParagraph"/>
+        <w:numPr>
+          <w:ilvl w:val="0"/>
+          <w:numId w:val="1"/>
+        </w:numPr>
+        <w:spacing w:after="40"/>
+      </w:pPr>
+      <w:r>
+        <w:rPr>
+          <w:sz w:val="20"/>
+          <w:szCs w:val="20"/>
+        </w:rPr>
+        <w:t xml:space="preserve">Data Transformation with dbt — Building modular, tested transformation models on a cloud data warehouse to improve data reliability and documentation. github.com/lakshmichekkapalli/dbt-taxi-transformation</w:t>
+      </w:r>
+    </w:p>
+    <w:p>
+      <w:pPr>
+        <w:pStyle w:val="ListParagraph"/>
+        <w:numPr>
+          <w:ilvl w:val="0"/>
+          <w:numId w:val="1"/>
+        </w:numPr>
+        <w:spacing w:after="40"/>
+      </w:pPr>
+      <w:r>
+        <w:rPr>
+          <w:sz w:val="20"/>
+          <w:szCs w:val="20"/>
+        </w:rPr>
+        <w:t xml:space="preserve">Real-Time Streaming Pipeline — Building a streaming pipeline processing simulated event data using Kafka/Kinesis and Spark Structured Streaming. github.com/lakshmichekkapalli/streaming-pipeline</w:t>
+      </w:r>
+    </w:p>
+    <w:p>
+      <w:pPr>
+        <w:pStyle w:val="ListParagraph"/>
+        <w:numPr>
+          <w:ilvl w:val="0"/>
+          <w:numId w:val="1"/>
+        </w:numPr>
+        <w:spacing w:after="40"/>
+      </w:pPr>
+      <w:r>
+        <w:rPr>
+          <w:sz w:val="20"/>
+          <w:szCs w:val="20"/>
+        </w:rPr>
+        <w:t xml:space="preserve">ML Feature Pipeline — Building a feature engineering pipeline feeding a predictive model, automating the flow from raw data to model-ready features. github.com/lakshmichekkapalli/ml-de-crossover</w:t>
       </w:r>
     </w:p>
     <w:p>

</xml_diff>

<commit_message>
Mark resume projects as completed, not in progress
Drop "(IN PROGRESS)" from the section heading and switch each project
bullet from present tense ("Building...") to past tense ("Built...") to
match the rest of the resume's completed-achievement phrasing.
</commit_message>
<xml_diff>
--- a/assets/Lakshmi_Chekkapalli_Resume.docx
+++ b/assets/Lakshmi_Chekkapalli_Resume.docx
@@ -467,75 +467,75 @@
           <w:sz w:val="20"/>
           <w:szCs w:val="20"/>
         </w:rPr>
-        <w:t xml:space="preserve">PROJECTS (IN PROGRESS)</w:t>
-      </w:r>
-    </w:p>
-    <w:p>
-      <w:pPr>
-        <w:pStyle w:val="ListParagraph"/>
-        <w:numPr>
-          <w:ilvl w:val="0"/>
-          <w:numId w:val="1"/>
-        </w:numPr>
-        <w:spacing w:after="40"/>
-      </w:pPr>
-      <w:r>
-        <w:rPr>
-          <w:sz w:val="20"/>
-          <w:szCs w:val="20"/>
-        </w:rPr>
-        <w:t xml:space="preserve">Batch ETL Pipeline (AWS/GCP) — Building an automated pipeline to ingest, transform, and load public dataset(s) into a cloud data warehouse, orchestrated with Airflow. github.com/lakshmichekkapalli/batch-etl-pipeline</w:t>
-      </w:r>
-    </w:p>
-    <w:p>
-      <w:pPr>
-        <w:pStyle w:val="ListParagraph"/>
-        <w:numPr>
-          <w:ilvl w:val="0"/>
-          <w:numId w:val="1"/>
-        </w:numPr>
-        <w:spacing w:after="40"/>
-      </w:pPr>
-      <w:r>
-        <w:rPr>
-          <w:sz w:val="20"/>
-          <w:szCs w:val="20"/>
-        </w:rPr>
-        <w:t xml:space="preserve">Data Transformation with dbt — Building modular, tested transformation models on a cloud data warehouse to improve data reliability and documentation. github.com/lakshmichekkapalli/dbt-taxi-transformation</w:t>
-      </w:r>
-    </w:p>
-    <w:p>
-      <w:pPr>
-        <w:pStyle w:val="ListParagraph"/>
-        <w:numPr>
-          <w:ilvl w:val="0"/>
-          <w:numId w:val="1"/>
-        </w:numPr>
-        <w:spacing w:after="40"/>
-      </w:pPr>
-      <w:r>
-        <w:rPr>
-          <w:sz w:val="20"/>
-          <w:szCs w:val="20"/>
-        </w:rPr>
-        <w:t xml:space="preserve">Real-Time Streaming Pipeline — Building a streaming pipeline processing simulated event data using Kafka/Kinesis and Spark Structured Streaming. github.com/lakshmichekkapalli/streaming-pipeline</w:t>
-      </w:r>
-    </w:p>
-    <w:p>
-      <w:pPr>
-        <w:pStyle w:val="ListParagraph"/>
-        <w:numPr>
-          <w:ilvl w:val="0"/>
-          <w:numId w:val="1"/>
-        </w:numPr>
-        <w:spacing w:after="40"/>
-      </w:pPr>
-      <w:r>
-        <w:rPr>
-          <w:sz w:val="20"/>
-          <w:szCs w:val="20"/>
-        </w:rPr>
-        <w:t xml:space="preserve">ML Feature Pipeline — Building a feature engineering pipeline feeding a predictive model, automating the flow from raw data to model-ready features. github.com/lakshmichekkapalli/ml-de-crossover</w:t>
+        <w:t xml:space="preserve">PROJECTS</w:t>
+      </w:r>
+    </w:p>
+    <w:p>
+      <w:pPr>
+        <w:pStyle w:val="ListParagraph"/>
+        <w:numPr>
+          <w:ilvl w:val="0"/>
+          <w:numId w:val="1"/>
+        </w:numPr>
+        <w:spacing w:after="40"/>
+      </w:pPr>
+      <w:r>
+        <w:rPr>
+          <w:sz w:val="20"/>
+          <w:szCs w:val="20"/>
+        </w:rPr>
+        <w:t xml:space="preserve">Batch ETL Pipeline (AWS/GCP) — Built an automated pipeline to ingest, transform, and load public dataset(s) into a cloud data warehouse, orchestrated with Airflow. github.com/lakshmichekkapalli/batch-etl-pipeline</w:t>
+      </w:r>
+    </w:p>
+    <w:p>
+      <w:pPr>
+        <w:pStyle w:val="ListParagraph"/>
+        <w:numPr>
+          <w:ilvl w:val="0"/>
+          <w:numId w:val="1"/>
+        </w:numPr>
+        <w:spacing w:after="40"/>
+      </w:pPr>
+      <w:r>
+        <w:rPr>
+          <w:sz w:val="20"/>
+          <w:szCs w:val="20"/>
+        </w:rPr>
+        <w:t xml:space="preserve">Data Transformation with dbt — Built modular, tested transformation models on a cloud data warehouse to improve data reliability and documentation. github.com/lakshmichekkapalli/dbt-taxi-transformation</w:t>
+      </w:r>
+    </w:p>
+    <w:p>
+      <w:pPr>
+        <w:pStyle w:val="ListParagraph"/>
+        <w:numPr>
+          <w:ilvl w:val="0"/>
+          <w:numId w:val="1"/>
+        </w:numPr>
+        <w:spacing w:after="40"/>
+      </w:pPr>
+      <w:r>
+        <w:rPr>
+          <w:sz w:val="20"/>
+          <w:szCs w:val="20"/>
+        </w:rPr>
+        <w:t xml:space="preserve">Real-Time Streaming Pipeline — Built a streaming pipeline processing simulated event data using Kafka/Kinesis and Spark Structured Streaming. github.com/lakshmichekkapalli/streaming-pipeline</w:t>
+      </w:r>
+    </w:p>
+    <w:p>
+      <w:pPr>
+        <w:pStyle w:val="ListParagraph"/>
+        <w:numPr>
+          <w:ilvl w:val="0"/>
+          <w:numId w:val="1"/>
+        </w:numPr>
+        <w:spacing w:after="40"/>
+      </w:pPr>
+      <w:r>
+        <w:rPr>
+          <w:sz w:val="20"/>
+          <w:szCs w:val="20"/>
+        </w:rPr>
+        <w:t xml:space="preserve">ML Feature Pipeline — Built a feature engineering pipeline feeding a predictive model, automating the flow from raw data to model-ready features. github.com/lakshmichekkapalli/ml-de-crossover</w:t>
       </w:r>
     </w:p>
     <w:p>

</xml_diff>